<commit_message>
docs(bdr): refresh decision export after Week 9 merge
Regenerate the CAA 131026 BDR export from canonical Markdown after merging current main, preserving T-77 and T-78 alongside T-79 to T-91 and the reconciled open questions.

Source: docs/source-of-truth.md; Week 9 C-71 to C-136
</commit_message>
<xml_diff>
--- a/docs/BACKLOG DECISION REVIEW CAA 131026.docx
+++ b/docs/BACKLOG DECISION REVIEW CAA 131026.docx
@@ -14347,6 +14347,72 @@
           </w:p>
         </w:tc>
       </w:tr>
+      <w:tr>
+        <w:tc>
+          <w:tcPr>
+            <w:tcW w:type="dxa" w:w="1728"/>
+          </w:tcPr>
+          <w:p>
+            <w:r>
+              <w:t>T-77</w:t>
+            </w:r>
+          </w:p>
+        </w:tc>
+        <w:tc>
+          <w:tcPr>
+            <w:tcW w:type="dxa" w:w="1728"/>
+          </w:tcPr>
+          <w:p>
+            <w:r>
+              <w:t>E06-S02 checks operating hours; E06-S01 retains display-only hours</w:t>
+            </w:r>
+          </w:p>
+        </w:tc>
+        <w:tc>
+          <w:tcPr>
+            <w:tcW w:type="dxa" w:w="1728"/>
+          </w:tcPr>
+          <w:p>
+            <w:r>
+              <w:t>Product Owner clarification supplied on 8 October 2026: E06-S02 marks a venue Unsuitable when the event is outside operating hours and names "outside operating hours" as a failed criterion. An event fully within hours passes that criterion. Suitability remains advisory: an unsuitable venue may still be requested and its failures must be available to Venue Staff deciding the request. E06-S02 does not itself block booking. E06-S01 keeps its existing search behaviour, with operating hours display-only. The implementation uses the existing venue calendar Singapore timezone and same-day opening-window model; exact opening/closing boundaries pass.</w:t>
+            </w:r>
+          </w:p>
+        </w:tc>
+        <w:tc>
+          <w:tcPr>
+            <w:tcW w:type="dxa" w:w="1728"/>
+          </w:tcPr>
+          <w:p>
+            <w:r>
+              <w:t>E06-S01, E06-S02 / SCRUM-46, E06-S03, E06-S04</w:t>
+            </w:r>
+          </w:p>
+        </w:tc>
+        <w:tc>
+          <w:tcPr>
+            <w:tcW w:type="dxa" w:w="1728"/>
+          </w:tcPr>
+          <w:p>
+            <w:r>
+              <w:t>Product Owner confirmation relayed by story owner, 2026-10-08; T-13, T-48, T-63</w:t>
+            </w:r>
+          </w:p>
+        </w:tc>
+      </w:tr>
+    </w:tbl>
+    <w:tbl>
+      <w:tblPr>
+        <w:tblStyle w:val="TableGrid"/>
+        <w:tblW w:type="auto" w:w="0"/>
+        <w:tblLook w:firstColumn="1" w:firstRow="1" w:lastColumn="0" w:lastRow="0" w:noHBand="0" w:noVBand="1" w:val="04A0"/>
+      </w:tblPr>
+      <w:tblGrid>
+        <w:gridCol w:w="1728"/>
+        <w:gridCol w:w="1728"/>
+        <w:gridCol w:w="1728"/>
+        <w:gridCol w:w="1728"/>
+        <w:gridCol w:w="1728"/>
+      </w:tblGrid>
       <w:tr>
         <w:tc>
           <w:tcPr>
@@ -20273,6 +20339,47 @@
     <w:p>
       <w:r>
         <w:t>SCRUM-86 automatically.</w:t>
+      </w:r>
+    </w:p>
+    <w:p>
+      <w:pPr>
+        <w:pStyle w:val="Heading2"/>
+      </w:pPr>
+      <w:r>
+        <w:rPr>
+          <w:sz w:val="28"/>
+        </w:rPr>
+        <w:t>8 October 2026: E06-S02 operating-hours clarification</w:t>
+      </w:r>
+    </w:p>
+    <w:p>
+      <w:r>
+        <w:t>T-77 records the Product Owner clarification relayed by the story owner:</w:t>
+      </w:r>
+    </w:p>
+    <w:p>
+      <w:r>
+        <w:t>E06-S02 flags an event outside venue operating hours as unsuitable, explicitly</w:t>
+      </w:r>
+    </w:p>
+    <w:p>
+      <w:r>
+        <w:t>naming the failure. Fully contained events pass. The result stays advisory and</w:t>
+      </w:r>
+    </w:p>
+    <w:p>
+      <w:r>
+        <w:t>must be available to Venue Staff in the owning booking workflow. E06-S01 search</w:t>
+      </w:r>
+    </w:p>
+    <w:p>
+      <w:r>
+        <w:t>continues without an operating-hours suitability filter. Both backlog views and</w:t>
+      </w:r>
+    </w:p>
+    <w:p>
+      <w:r>
+        <w:t>TC_E06S02_05 carry the clarification; Jira reconciliation follows merge.</w:t>
       </w:r>
     </w:p>
     <w:p>

</xml_diff>

<commit_message>
docs(backlog): align Week 9 stories and acceptance cases
Update Release 1 and product stories, canonical acceptance cases, and generated exports for the accepted Week 9 answers. Preserve Sprint 3 and Done-story boundaries; track O-50 and O-51 as open assumptions.

Related: SCRUM-30, SCRUM-39, E02-S05, E02-S07, E04-S02, E07-S08. Source: docs/bdr/ and docs/source-of-truth.md.
</commit_message>
<xml_diff>
--- a/docs/BACKLOG DECISION REVIEW CAA 131026.docx
+++ b/docs/BACKLOG DECISION REVIEW CAA 131026.docx
@@ -28,7 +28,7 @@
     </w:p>
     <w:p>
       <w:r>
-        <w:t>Version 8  ·  13 October 2026</w:t>
+        <w:t>Version 9  ·  13 October 2026</w:t>
       </w:r>
     </w:p>
     <w:p>
@@ -44,12 +44,33 @@
     </w:p>
     <w:p>
       <w:r>
-        <w:t>This document holds every decision behind the backlog and the evidence for it. The backlogs themselves live in CONNECTSPHERE BACKLOGS CAA 140926.xlsx and contain story data only; each story there carries a Backlog Decision Reference pointing back to the entries here.</w:t>
+        <w:t>This document holds every decision behind the backlog and the evidence for it. The backlogs themselves are canonical Markdown under `docs/backlog/`; generated workbook `CONNECTSPHERE BACKLOGS CAA 131026.xlsx` contains story data, with each story carrying a Backlog Decision Reference pointing back to the entries here.</w:t>
       </w:r>
     </w:p>
     <w:p>
       <w:r>
         <w:t>It exists to answer one question for any story or acceptance criterion: why is this here, and who decided it. Entries are separated into what the customer told us and what the team chose, because those carry different weight. Where the team chose, the entry says so plainly rather than presenting an assumption as a requirement.</w:t>
+      </w:r>
+    </w:p>
+    <w:p>
+      <w:pPr>
+        <w:pStyle w:val="Heading2"/>
+      </w:pPr>
+      <w:r>
+        <w:rPr>
+          <w:sz w:val="28"/>
+        </w:rPr>
+        <w:t>What changed in version 9</w:t>
+      </w:r>
+    </w:p>
+    <w:p>
+      <w:r>
+        <w:t>Applied the Week 9 decisions to eligible future backlog stories and recorded two residual design assumptions as O-50 and O-51. E04-S02 and E02-S05 are included in Release 1; E02-S07 and E07-S08 carry new date-horizon and Session-linked equipment behavior without reopening completed stories. Sprint 3 criteria remain deferred until its close under T-73. Canonical acceptance cases were aligned for those changes; the remaining architecture, UI flows, implementation, Jira reconciliation and peer review are tracked in the impact register.</w:t>
+      </w:r>
+    </w:p>
+    <w:p>
+      <w:r>
+        <w:t>Release 1 currently contains 60 stories and 173 estimated points. Four stories have no sprint assignment; E02-S07 and E07-S08 also have no estimate pending planning. The total excludes estimates for those two stories and may change after planning. Eight items remain open: O-08, O-11, O-12, O-13, O-18, O-19, O-50 and O-51; the first six are outside Release 1, while O-50/O-51 affect the assumptions for E09-S02/S04 and E02-S05.</w:t>
       </w:r>
     </w:p>
     <w:p>
@@ -70,7 +91,7 @@
     </w:p>
     <w:p>
       <w:r>
-        <w:t>The canonical lifecycle now returns a Confirmed event to Planning automatically when venue loss triggers change review; completed arrangements enter Safety Review automatically. The safety record includes both the team's per-factor checklist and the decision/comments required by C-134. One event registration can select multiple Sessions while both per-Session and combined event capacities are enforced. Open-ended blocks follow T-80 as a team resolution, preserving C-111's conflicting answer in the source record. The downstream backlog, acceptance cases, architecture and UI flows are being aligned to these decisions in this change set; implementation and Jira reconciliation follow the repository's source-of-truth workflow.</w:t>
+        <w:t>The canonical lifecycle returns a Confirmed event to Planning automatically when venue loss triggers change review; completed arrangements enter Safety Review automatically. The safety record includes both the team's per-factor checklist and the decision/comments required by C-134. One event registration can select multiple Sessions while both per-Session and combined event capacities are enforced. Open-ended blocks follow T-80 as a team resolution, preserving C-111's conflicting answer in the source record. Generated exports follow their Markdown sources; implementation and Jira reconciliation follow the source-of-truth workflow.</w:t>
       </w:r>
     </w:p>
     <w:p>
@@ -120,11 +141,6 @@
       </w:r>
     </w:p>
     <w:p>
-      <w:r>
-        <w:t>Release 1 grows beyond 47 stories and 155 points. The new story count, estimates and sprint placement are set in the backlog PR that follows this one; the architecture, C4 model, user flows, database schema and ADR-003, ADR-007, ADR-009 and ADR-012 all change and are handled in the architecture PR.</w:t>
-      </w:r>
-    </w:p>
-    <w:p>
       <w:pPr>
         <w:pStyle w:val="Heading2"/>
       </w:pPr>
@@ -157,7 +173,7 @@
     </w:p>
     <w:p>
       <w:r>
-        <w:t>Six items remain open, all on stories outside Release 1: O-08, O-11, O-12, O-13, O-18 and O-19. Each will be decided if and when its story is scheduled.</w:t>
+        <w:t>As of version 8, six items remained open on stories outside Release 1: O-08, O-11, O-12, O-13, O-18 and O-19. Version 9 adds the two explicit Week 9 design assumptions O-50/O-51 listed above.</w:t>
       </w:r>
     </w:p>
     <w:p>
@@ -14492,7 +14508,7 @@
           </w:tcPr>
           <w:p>
             <w:r>
-              <w:t>The team adopts Week 9 C-107 for multi-session events, reversing T-48 and the Week 4 C-62 interpretation. An Event may own one or more Sessions. Venue bookings and equipment requests/reservations attach to a Session; registrations remain one event-level registration per account and select one or more Sessions (T-85). Event-level lifecycle, registration window and technical-support assignment remain event-level unless another accepted criterion requires a session link. Revisit ADR-004/005 and all dependent stories, cases, schema, APIs and implementation; do not imply the customer's Week 4 answer was wrong when recorded.</w:t>
+              <w:t>The team adopts Week 9 C-107 for multi-session events, reversing T-48 and the Week 4 C-62 interpretation. An Event may own one or more Sessions. Venue bookings and equipment requests/reservations attach to a Session; registrations remain one event-level registration per account and select one or more Sessions (T-85). For a session-linked venue booking, its own headcount remains authoritative; when it is absent, use that Session's expected attendance, refining T-78's event-level fallback for restored Sessions. Event-level lifecycle, registration window and technical-support assignment remain event-level unless another accepted criterion requires a session link. Revisit ADR-004/005 and all dependent stories, cases, schema, APIs and implementation; do not imply the customer's Week 4 answer was wrong when recorded.</w:t>
             </w:r>
           </w:p>
         </w:tc>
@@ -17772,6 +17788,110 @@
           <w:p>
             <w:r>
               <w:t>Closed</w:t>
+            </w:r>
+          </w:p>
+        </w:tc>
+      </w:tr>
+      <w:tr>
+        <w:tc>
+          <w:tcPr>
+            <w:tcW w:type="dxa" w:w="1728"/>
+          </w:tcPr>
+          <w:p>
+            <w:r>
+              <w:t>O-50</w:t>
+            </w:r>
+          </w:p>
+        </w:tc>
+        <w:tc>
+          <w:tcPr>
+            <w:tcW w:type="dxa" w:w="1728"/>
+          </w:tcPr>
+          <w:p>
+            <w:r>
+              <w:t>Waiting-list behavior for a full Session</w:t>
+            </w:r>
+          </w:p>
+        </w:tc>
+        <w:tc>
+          <w:tcPr>
+            <w:tcW w:type="dxa" w:w="1728"/>
+          </w:tcPr>
+          <w:p>
+            <w:r>
+              <w:t>OPEN. T-85 sends over-capacity Session/Event registrations to the Organiser as Pending and retains the Event-level waitlist when the combined Event capacity is full. It does not define a separate per-Session waiting list. Working assumption: no per-Session waitlist in Release 1; verify that an attendee whose selected Session is full receives the Pending decision path and cannot waitlist that Session independently.</w:t>
+            </w:r>
+          </w:p>
+        </w:tc>
+        <w:tc>
+          <w:tcPr>
+            <w:tcW w:type="dxa" w:w="1728"/>
+          </w:tcPr>
+          <w:p>
+            <w:r>
+              <w:t>C-78, C-97, C-98, C-107, T-85</w:t>
+            </w:r>
+          </w:p>
+        </w:tc>
+        <w:tc>
+          <w:tcPr>
+            <w:tcW w:type="dxa" w:w="1728"/>
+          </w:tcPr>
+          <w:p>
+            <w:r>
+              <w:t>Medium</w:t>
+            </w:r>
+          </w:p>
+        </w:tc>
+      </w:tr>
+      <w:tr>
+        <w:tc>
+          <w:tcPr>
+            <w:tcW w:type="dxa" w:w="1728"/>
+          </w:tcPr>
+          <w:p>
+            <w:r>
+              <w:t>O-51</w:t>
+            </w:r>
+          </w:p>
+        </w:tc>
+        <w:tc>
+          <w:tcPr>
+            <w:tcW w:type="dxa" w:w="1728"/>
+          </w:tcPr>
+          <w:p>
+            <w:r>
+              <w:t>Scope copied by Reuse a previous event</w:t>
+            </w:r>
+          </w:p>
+        </w:tc>
+        <w:tc>
+          <w:tcPr>
+            <w:tcW w:type="dxa" w:w="1728"/>
+          </w:tcPr>
+          <w:p>
+            <w:r>
+              <w:t>OPEN. C-74 confirms an Organiser may copy their own completed/past request; it does not enumerate which Session details or transactional records are copied. Working assumption: copy Session structure and requirements, clear all dates/times, and do not copy bookings, equipment reservations, or registrations.</w:t>
+            </w:r>
+          </w:p>
+        </w:tc>
+        <w:tc>
+          <w:tcPr>
+            <w:tcW w:type="dxa" w:w="1728"/>
+          </w:tcPr>
+          <w:p>
+            <w:r>
+              <w:t>C-74, C-107, T-79, T-90</w:t>
+            </w:r>
+          </w:p>
+        </w:tc>
+        <w:tc>
+          <w:tcPr>
+            <w:tcW w:type="dxa" w:w="1728"/>
+          </w:tcPr>
+          <w:p>
+            <w:r>
+              <w:t>Medium</w:t>
             </w:r>
           </w:p>
         </w:tc>
@@ -20703,6 +20823,22 @@
     <w:p>
       <w:r>
         <w:t>sources. Jira changes remain downstream of the merged canonical backlog.</w:t>
+      </w:r>
+    </w:p>
+    <w:p>
+      <w:pPr>
+        <w:pStyle w:val="Heading2"/>
+      </w:pPr>
+      <w:r>
+        <w:rPr>
+          <w:sz w:val="28"/>
+        </w:rPr>
+        <w:t>Version 8 to version 9</w:t>
+      </w:r>
+    </w:p>
+    <w:p>
+      <w:r>
+        <w:t>Applied Week 9 choices to eligible stories and recorded remaining assumptions. Restored E04-S02 and added E02-S05 to Release 1; added E02-S07 for the two-year date horizon and E07-S08 for Session-linked equipment behavior. Updated Sprint 4 registration, arrangement-change, safety-reversion, rescheduling and cancellation criteria while leaving Sprint 3 stories untouched until close under T-73. Added O-50 for Session waitlist behavior and O-51 for copied Session/arrangement data; both remain explicit assumptions for review.</w:t>
       </w:r>
     </w:p>
     <w:p>

</xml_diff>

<commit_message>
docs(architecture): align Week 9 schema and UI handoff
Source: docs/source-of-truth.md; BDR T-79 to T-91.

Follow-up to Week 9 PRs #253 and #254.
</commit_message>
<xml_diff>
--- a/docs/BACKLOG DECISION REVIEW CAA 131026.docx
+++ b/docs/BACKLOG DECISION REVIEW CAA 131026.docx
@@ -65,7 +65,7 @@
     </w:p>
     <w:p>
       <w:r>
-        <w:t>Applied the Week 9 decisions to eligible future backlog stories and recorded two residual design assumptions as O-50 and O-51. E04-S02 and E02-S05 are included in Release 1; E02-S07 and E07-S08 carry new date-horizon and Session-linked equipment behavior without reopening completed stories. Sprint 3 criteria remain deferred until its close under T-73. Canonical acceptance cases were aligned for those changes; the remaining architecture, UI flows, implementation, Jira reconciliation and peer review are tracked in the impact register.</w:t>
+        <w:t>Applied the Week 9 decisions to eligible future backlog stories and recorded two residual design assumptions as O-50 and O-51. E04-S02 and E02-S05 are included in Release 1; E02-S07 and E07-S08 carry new date-horizon and Session-linked equipment behavior without reopening completed stories. Sprint 3 criteria remain deferred until its close under T-73. Canonical acceptance cases, ADRs, target schema/contracts, architecture views and repository UI/UX handoff are aligned in the stacked follow-ups. Actual Figma frames and application code remain downstream; Jira reconciliation waits until canonical Markdown merges.</w:t>
       </w:r>
     </w:p>
     <w:p>
@@ -14508,7 +14508,7 @@
           </w:tcPr>
           <w:p>
             <w:r>
-              <w:t>The team adopts Week 9 C-107 for multi-session events, reversing T-48 and the Week 4 C-62 interpretation. An Event may own one or more Sessions. Venue bookings and equipment requests/reservations attach to a Session; registrations remain one event-level registration per account and select one or more Sessions (T-85). For a session-linked venue booking, its own headcount remains authoritative; when it is absent, use that Session's expected attendance, refining T-78's event-level fallback for restored Sessions. Event-level lifecycle, registration window and technical-support assignment remain event-level unless another accepted criterion requires a session link. Revisit ADR-004/005 and all dependent stories, cases, schema, APIs and implementation; do not imply the customer's Week 4 answer was wrong when recorded.</w:t>
+              <w:t>The team adopts Week 9 C-107 for multi-session events, reversing T-48 and the Week 4 C-62 interpretation. An Event may own one or more Sessions. Venue bookings and equipment requests/reservations attach to a Session; registrations remain one event-level registration per account and select one or more Sessions (T-85). For a session-linked venue booking, its own headcount remains authoritative; when it is absent, use that Session's expected attendance, refining T-78's event-level fallback for restored Sessions. Retain the Event's expected-attendance value as the overall planning total and store each Session's attendance separately; this is a team design choice, not a new customer answer. Event-level lifecycle, registration window and technical-support assignment remain event-level unless another accepted criterion requires a session link. Revisit ADR-004/005 and all dependent stories, cases, schema, APIs and implementation; do not imply the customer's Week 4 answer was wrong when recorded.</w:t>
             </w:r>
           </w:p>
         </w:tc>
@@ -14882,7 +14882,7 @@
           </w:tcPr>
           <w:p>
             <w:r>
-              <w:t>ADR-012, ADR-007, user/role schema, access-control and route tests</w:t>
+              <w:t>ADR-019 (supersedes ADR-012), ADR-007, user/role schema, access-control and route tests</w:t>
             </w:r>
           </w:p>
         </w:tc>
@@ -17507,17 +17507,17 @@
           </w:tcPr>
           <w:p>
             <w:r>
-              <w:t>CLOSED as a team choice in T-86: one account may hold multiple roles; seed data assigns one role per account. C-136 confirms preloaded accounts and no self-registration, not role cardinality. ADR-012 is amended to remove the single-role constraint.</w:t>
-            </w:r>
-          </w:p>
-        </w:tc>
-        <w:tc>
-          <w:tcPr>
-            <w:tcW w:type="dxa" w:w="1728"/>
-          </w:tcPr>
-          <w:p>
-            <w:r>
-              <w:t>C-69, C-70, C-84, C-136, C-57, T-72, T-86</w:t>
+              <w:t>CLOSED as a team choice in T-86: one account may hold multiple roles; seed data assigns one role per account. C-136 confirms preloaded accounts and no self-registration, not role cardinality. ADR-019 supersedes ADR-012's single-role constraint.</w:t>
+            </w:r>
+          </w:p>
+        </w:tc>
+        <w:tc>
+          <w:tcPr>
+            <w:tcW w:type="dxa" w:w="1728"/>
+          </w:tcPr>
+          <w:p>
+            <w:r>
+              <w:t>C-69, C-70, C-84, C-136, C-57, T-72, T-86, ADR-019</w:t>
             </w:r>
           </w:p>
         </w:tc>
@@ -18453,7 +18453,7 @@
     </w:p>
     <w:p>
       <w:r>
-        <w:t>Recorded so a reader can see these were considered and excluded rather than overlooked. 22 stories are held in the product backlog for future releases. Two further rows (E05-S05 and E10-S05) are kept below although they returned to Release 1 in version 6, so the reason they were once out, and the customer change that brought them back, can both be read.</w:t>
+        <w:t>Recorded so a reader can see these were considered and excluded rather than overlooked. 20 stories remain outside Release 1. Four further rows (E05-S05 and E10-S05 in version 6; E02-S05 and E04-S02 in version 9) are kept as historical context although they returned to Release 1.</w:t>
       </w:r>
     </w:p>
     <w:tbl>
@@ -18622,7 +18622,7 @@
           </w:tcPr>
           <w:p>
             <w:r>
-              <w:t>Out of Release 1, retained as future scope. Hsu (G2) confirmed a user may hold different roles depending on organisation structure, so this is a real requirement, not speculation. Release 1 assumes one role per account.</w:t>
+              <w:t>The role-switcher UI story remains out of Release 1. T-86/ADR-019 now support multiple role memberships; seed data still assigns one role per account. The API authorizes each granted role. A dedicated switcher is a future interface decision, not a one-role product constraint.</w:t>
             </w:r>
           </w:p>
         </w:tc>
@@ -18686,7 +18686,7 @@
           </w:tcPr>
           <w:p>
             <w:r>
-              <w:t>Not among the 20 core features required for the first release; retained as future scope.</w:t>
+              <w:t>**Returned to Release 1 in version 9 (C-74, T-90).** Its earlier exclusion was based on the Week 4 core-feature boundary. Retained here as history; included in Release 1 at its existing 3-point estimate, without sprint assignment.</w:t>
             </w:r>
           </w:p>
         </w:tc>
@@ -18782,7 +18782,7 @@
           </w:tcPr>
           <w:p>
             <w:r>
-              <w:t>Withdrawn from Release 1 in version 4. Bryan (G1), Week 4 (C-62): multi-session events must be set up as separate events, and the Organiser creates one event per session. Multi-session was never among the twenty core features in the Week 4 instructions, so this realigns the release with them. Retained here as future scope. Withdrawing it also retires ADR-004 and ADR-005.</w:t>
+              <w:t>**Restored to Release 1 in version 9 (C-107, T-79).** C-62 remains the historical Week 4 answer; the team now follows the Week 9 Session model and retains Event-level lifecycle/registration. Retained here as history; included in Release 1 at its existing 5-point estimate, without sprint assignment. ADR-018 records the current model.</w:t>
             </w:r>
           </w:p>
         </w:tc>

</xml_diff>